<commit_message>
Fix reference [16] metadata with verified Crossref record (Gan et al. 2017, JCLEPRO)
</commit_message>
<xml_diff>
--- a/05_Drafts/manuscript/MANUSCRIPT_FULL.docx
+++ b/05_Drafts/manuscript/MANUSCRIPT_FULL.docx
@@ -200,7 +200,7 @@
         <w:pStyle w:val="BodyText"/>
       </w:pPr>
       <w:r>
-        <w:t xml:space="preserve">However, existing comparative assessments predominantly focus on raw materials, individual structural members, or whole-building envelopes. To the author’s knowledge, they rarely examine spatial skeletal systems where bamboo and conventional structural steel are each optimized to their own cross-sectional limits under identical structural geometry, design loading combinations, and normative design codes. Structure-level sizing is necessary: the structural mass, financial expenditure, and embodied carbon of any spatial framework depend directly on cross-sectional efficiency, member slenderness, and connection detailing, given that spatial lattice structures incorporate numerous member ends converging at multi-directional joint hubs. Furthermore, life-cycle, embodied energy, and embodied carbon assessments across civil engineering have shown that structural framing systems and secondary components can represent substantial portions of total cradle-to-gate emissions [14, 15, 17, 18], prompting structural optimization frameworks tailored to embodied energy and carbon mitigation [16, 19]. To the author’s knowledge, comparative studies evaluating structural bamboo space domes against equivalent steel configurations under normative, code-compliant sizing optimization are limited. Quantifying these trade-offs across material weight, embodied</w:t>
+        <w:t xml:space="preserve">However, existing comparative assessments predominantly focus on raw materials, individual structural members, or whole-building envelopes. To the author’s knowledge, they rarely examine spatial skeletal systems where bamboo and conventional structural steel are each optimized to their own cross-sectional limits under identical structural geometry, design loading combinations, and normative design codes. Structure-level sizing is necessary: the structural mass, financial expenditure, and embodied carbon of any spatial framework depend directly on cross-sectional efficiency, member slenderness, and connection detailing, given that spatial lattice structures incorporate numerous member ends converging at multi-directional joint hubs. Furthermore, life-cycle, embodied energy, and embodied carbon assessments across civil engineering have shown that structural framing systems and secondary components can represent substantial portions of total cradle-to-gate emissions [14, 16, 17, 18], prompting structural optimization and sustainable design frameworks tailored to embodied energy and carbon mitigation [15, 19]. To the author’s knowledge, comparative studies evaluating structural bamboo space domes against equivalent steel configurations under normative, code-compliant sizing optimization are limited. Quantifying these trade-offs across material weight, embodied</w:t>
       </w:r>
       <w:r>
         <w:t xml:space="preserve"> </w:t>
@@ -22429,7 +22429,7 @@
         <w:pStyle w:val="BodyText"/>
       </w:pPr>
       <w:r>
-        <w:t xml:space="preserve">[16] Gan, V.J.L., Cheng, J.C.P., Lo, I.M.C., 2017. Integrating life cycle assessment and buildability for sustainable structural design. Journal of Cleaner Production 162, 1068–1082. https://doi.org/10.1016/j.jclepro.2017.06.096</w:t>
+        <w:t xml:space="preserve">[16] Gan, V.J.L., Cheng, J.C.P., Lo, I.M.C., Chan, C.M., 2017. Developing a CO2-e accounting method for quantification and analysis of embodied carbon in high-rise buildings. Journal of Cleaner Production 141, 825–836. https://doi.org/10.1016/j.jclepro.2016.09.126</w:t>
       </w:r>
     </w:p>
     <w:p>

</xml_diff>

<commit_message>
Refine citation placements: remove [11] from 2.3/Disc, [13] from 3.2, [29] from 3.1, soften [12] in 2.3
</commit_message>
<xml_diff>
--- a/05_Drafts/manuscript/MANUSCRIPT_FULL.docx
+++ b/05_Drafts/manuscript/MANUSCRIPT_FULL.docx
@@ -2350,7 +2350,7 @@
         <w:t xml:space="preserve"> </w:t>
       </w:r>
       <w:r>
-        <w:t xml:space="preserve">governed by Ylinen’s non-linear column formulation [1, 12, 36]:</w:t>
+        <w:t xml:space="preserve">governed by Ylinen’s non-linear column formulation [1, 36]:</w:t>
       </w:r>
     </w:p>
     <w:p>
@@ -3272,7 +3272,7 @@
         </m:sSub>
       </m:oMath>
       <w:r>
-        <w:t xml:space="preserve">). Experimental validation of column buckling behavior and Ylinen constants for Guadua culms is detailed by Bahtiar et al. [12], while complete mechanical derivations are provided in Supplementary Material Appendix S3.</w:t>
+        <w:t xml:space="preserve">). Column buckling tests on Guadua culms are reported in [12], while complete mechanical derivations are provided in Supplementary Material Appendix S3.</w:t>
       </w:r>
     </w:p>
     <w:p>
@@ -3767,7 +3767,7 @@
         <w:t xml:space="preserve"> </w:t>
       </w:r>
       <w:r>
-        <w:t xml:space="preserve">is the allowable double-shear capacity of a single steel bolt embedded in a mortared bamboo culm based on NSR-10 (Table G.12.11-2 [37]) and empirical connection tests on Guadua culms [11],</w:t>
+        <w:t xml:space="preserve">is the allowable double-shear capacity of a single steel bolt embedded in a mortared bamboo culm (Table G.12.11-2 of NSR-10 [37]),</w:t>
       </w:r>
       <w:r>
         <w:t xml:space="preserve"> </w:t>
@@ -8174,7 +8174,7 @@
         <w:pStyle w:val="BodyText"/>
       </w:pPr>
       <w:r>
-        <w:t xml:space="preserve">The spatial layout of each dome configuration reflects standard spatial truss typologies established in the structural optimization literature [20, 29–31]:</w:t>
+        <w:t xml:space="preserve">The spatial layout of each dome configuration reflects standard spatial truss typologies established in the structural optimization literature [20, 30, 31]:</w:t>
       </w:r>
       <w:r>
         <w:t xml:space="preserve"> </w:t>
@@ -8240,7 +8240,7 @@
         <w:t xml:space="preserve"> </w:t>
       </w:r>
       <w:r>
-        <w:t xml:space="preserve">Derived from the well-established 40 m, 354-member benchmark space dome extensively investigated in steel optimization literature [20, 29–31]. In the original 354-member geometry, member lengths reach up to 5.97 m, which exceeds practical unbraced buckling limits for naturally grown structural bamboo culms. To make the topology viable for natural bio-materials without violating transportable culm lengths, a frequency-2 topological densification was executed, generating 505 nodes, 1464 members, and 43 design groups with member lengths strictly constrained between 0.76 m and 3.08 m. The 48 foundation support nodes are pinned.</w:t>
+        <w:t xml:space="preserve">Derived from the well-established 40 m, 354-member benchmark space dome extensively investigated in steel optimization literature [20, 30, 31]. In the original 354-member geometry, member lengths reach up to 5.97 m, which exceeds practical unbraced buckling limits for naturally grown structural bamboo culms. To make the topology viable for natural bio-materials without violating transportable culm lengths, a frequency-2 topological densification was executed, generating 505 nodes, 1464 members, and 43 design groups with member lengths strictly constrained between 0.76 m and 3.08 m. The 48 foundation support nodes are pinned.</w:t>
       </w:r>
       <w:r>
         <w:t xml:space="preserve"> </w:t>
@@ -8262,7 +8262,7 @@
         <w:t xml:space="preserve"> </w:t>
       </w:r>
       <w:r>
-        <w:t xml:space="preserve">In addition to the three bio-structural benchmark domes, the classical 40 m span, 354-member, 22-group Schwedler-type steel dome [20, 29–31] was analyzed under identical loading conditions as an external literature calibration anchor.</w:t>
+        <w:t xml:space="preserve">In addition to the three bio-structural benchmark domes, the classical 40 m span, 354-member, 22-group Schwedler-type steel dome [20, 30, 31] was analyzed under identical loading conditions as an external literature calibration anchor.</w:t>
       </w:r>
     </w:p>
     <w:p>
@@ -8592,7 +8592,7 @@
         <w:t xml:space="preserve"> </w:t>
       </w:r>
       <w:r>
-        <w:t xml:space="preserve">bamboo are established in strict accordance with ISO 22156:2021 [36], the IStructE bamboo design manual [1], and NSR-10 Title G [37], drawing upon characteristic experimental evaluations of structural bamboo culms [13]. Table 2 presents the material parameters and design factors adopted in the analysis.</w:t>
+        <w:t xml:space="preserve">bamboo are established in strict accordance with ISO 22156:2021 [36], the IStructE bamboo design manual [1], and NSR-10 Title G [37]. Table 2 presents the material parameters and design factors adopted in the analysis.</w:t>
       </w:r>
     </w:p>
     <w:tbl>
@@ -22076,7 +22076,7 @@
         <w:pStyle w:val="BodyText"/>
       </w:pPr>
       <w:r>
-        <w:t xml:space="preserve">Practical fabrication and spatial geometry impose additional structural limitations that must be addressed in actual implementation. While peak member axial forces reach up to 39.8 kN on the 40 m Ribbed dome (governing connection demand-to-capacity ratio D/C = 0.807), remaining within the 49.3 kN allowable capacity, spatial congestion in dense topologies emerges as a physical constraint. On the 40 m Ribbed dome, 12 short meridional members (0.76 m length) carrying axial loads up to 31.25 kN cannot satisfy the minimum codified bolt pitch and end distances prescribed by NSR-10 [37]. Accommodating the required three bolts necessitates at least 0.95 m of member length for compression members (0.80 m without the 150 mm mid-span clearance), consistent with empirical connection detailing limits established for Guadua culms [11, 37], indicating that standard through-bolted sleeve detailing cannot be universally applied to all members of dense spatial grids without custom nodal modifications. Moreover, the current structural model adopts idealized pin-ended member connections, neglecting semi-rigid joint rotational stiffness, eccentricities, and moisture-induced dimensional shrinkage, which represent subjects for future experimental and multi-scale numerical investigations.</w:t>
+        <w:t xml:space="preserve">Practical fabrication and spatial geometry impose additional structural limitations that must be addressed in actual implementation. While peak member axial forces reach up to 39.8 kN on the 40 m Ribbed dome (governing connection demand-to-capacity ratio D/C = 0.807), remaining within the 49.3 kN allowable capacity, spatial congestion in dense topologies emerges as a physical constraint. On the 40 m Ribbed dome, 12 short meridional members (0.76 m length) carrying axial loads up to 31.25 kN cannot satisfy the minimum codified bolt pitch and end distances prescribed by NSR-10 [37]. Accommodating the required three bolts necessitates at least 0.95 m of member length for compression members (0.80 m without the 150 mm mid-span clearance), indicating that standard through-bolted sleeve detailing cannot be universally applied to all members of dense spatial grids without custom nodal modifications. Moreover, the current structural model adopts idealized pin-ended member connections, neglecting semi-rigid joint rotational stiffness, eccentricities, and moisture-induced dimensional shrinkage, which represent subjects for future experimental and multi-scale numerical investigations.</w:t>
       </w:r>
     </w:p>
     <w:p>

</xml_diff>

<commit_message>
Correct reference [29] (Saka 1997, verified via Crossref); update best-solution carbon with manuscript emission factors
Co-Authored-By: Claude Sonnet 5.5 <noreply@anthropic.com>
</commit_message>
<xml_diff>
--- a/05_Drafts/manuscript/MANUSCRIPT_FULL.docx
+++ b/05_Drafts/manuscript/MANUSCRIPT_FULL.docx
@@ -2,32 +2,6 @@
 <file path=word/document.xml><?xml version="1.0" encoding="utf-8"?>
 <w:document xmlns:w="http://schemas.openxmlformats.org/wordprocessingml/2006/main" xmlns:m="http://schemas.openxmlformats.org/officeDocument/2006/math" xmlns:r="http://schemas.openxmlformats.org/officeDocument/2006/relationships" xmlns:o="urn:schemas-microsoft-com:office:office" xmlns:v="urn:schemas-microsoft-com:vml" xmlns:w10="urn:schemas-microsoft-com:office:word" xmlns:a="http://schemas.openxmlformats.org/drawingml/2006/main" xmlns:pic="http://schemas.openxmlformats.org/drawingml/2006/picture" xmlns:wp="http://schemas.openxmlformats.org/drawingml/2006/wordprocessingDrawing">
   <w:body>
-    <w:sdt>
-      <w:sdtPr>
-        <w:docPartObj>
-          <w:docPartGallery w:val="Table of Contents"/>
-          <w:docPartUnique/>
-        </w:docPartObj>
-      </w:sdtPr>
-      <w:sdtContent>
-        <w:p>
-          <w:pPr>
-            <w:pStyle w:val="TOCHeading"/>
-          </w:pPr>
-          <w:r>
-            <w:t xml:space="preserve">Table of Contents</w:t>
-          </w:r>
-        </w:p>
-        <w:p>
-          <w:r>
-            <w:fldChar w:fldCharType="begin" w:dirty="true"/>
-            <w:instrText xml:space="preserve">TOC \o "1-3" \h \z \u</w:instrText>
-            <w:fldChar w:fldCharType="separate"/>
-            <w:fldChar w:fldCharType="end"/>
-          </w:r>
-        </w:p>
-      </w:sdtContent>
-    </w:sdt>
     <w:p>
       <w:pPr>
         <w:pStyle w:val="Heading1"/>
@@ -22533,7 +22507,7 @@
         <w:pStyle w:val="BodyText"/>
       </w:pPr>
       <w:r>
-        <w:t xml:space="preserve">[29] Saka, M.P., 1991. Optimum design of steel frames with tapered members. Computers &amp; Structures 38 (1), 79–92. https://doi.org/10.1016/0045-7949(91)90205-Z</w:t>
+        <w:t xml:space="preserve">[29] Saka, M.P., 1997. Optimum design of steel frames with tapered members. Computers &amp; Structures 63 (4), 797–811. https://doi.org/10.1016/S0045-7949(96)00074-0</w:t>
       </w:r>
     </w:p>
     <w:p>

</xml_diff>

<commit_message>
Round 14: sync legacy carbon, add verified spatial bamboo literature, fix Supplementary formulas, and clarify LCI & Colombia pricing
</commit_message>
<xml_diff>
--- a/05_Drafts/manuscript/MANUSCRIPT_FULL.docx
+++ b/05_Drafts/manuscript/MANUSCRIPT_FULL.docx
@@ -2,6 +2,32 @@
 <file path=word/document.xml><?xml version="1.0" encoding="utf-8"?>
 <w:document xmlns:w="http://schemas.openxmlformats.org/wordprocessingml/2006/main" xmlns:m="http://schemas.openxmlformats.org/officeDocument/2006/math" xmlns:r="http://schemas.openxmlformats.org/officeDocument/2006/relationships" xmlns:o="urn:schemas-microsoft-com:office:office" xmlns:v="urn:schemas-microsoft-com:vml" xmlns:w10="urn:schemas-microsoft-com:office:word" xmlns:a="http://schemas.openxmlformats.org/drawingml/2006/main" xmlns:pic="http://schemas.openxmlformats.org/drawingml/2006/picture" xmlns:wp="http://schemas.openxmlformats.org/drawingml/2006/wordprocessingDrawing">
   <w:body>
+    <w:sdt>
+      <w:sdtPr>
+        <w:docPartObj>
+          <w:docPartGallery w:val="Table of Contents"/>
+          <w:docPartUnique/>
+        </w:docPartObj>
+      </w:sdtPr>
+      <w:sdtContent>
+        <w:p>
+          <w:pPr>
+            <w:pStyle w:val="TOCHeading"/>
+          </w:pPr>
+          <w:r>
+            <w:t xml:space="preserve">Table of Contents</w:t>
+          </w:r>
+        </w:p>
+        <w:p>
+          <w:r>
+            <w:fldChar w:fldCharType="begin" w:dirty="true"/>
+            <w:instrText xml:space="preserve">TOC \o "1-3" \h \z \u</w:instrText>
+            <w:fldChar w:fldCharType="separate"/>
+            <w:fldChar w:fldCharType="end"/>
+          </w:r>
+        </w:p>
+      </w:sdtContent>
+    </w:sdt>
     <w:p>
       <w:pPr>
         <w:pStyle w:val="Heading1"/>
@@ -174,7 +200,17 @@
         <w:pStyle w:val="BodyText"/>
       </w:pPr>
       <w:r>
-        <w:t xml:space="preserve">However, existing comparative assessments predominantly focus on raw materials, individual structural members, or whole-building envelopes. To the author’s knowledge, they rarely examine spatial skeletal systems where bamboo and conventional structural steel are each optimized to their own cross-sectional limits under identical structural geometry, design loading combinations, and normative design codes. Structure-level sizing is necessary: the structural mass, financial expenditure, and embodied carbon of any spatial framework depend directly on cross-sectional efficiency, member slenderness, and connection detailing, given that spatial lattice structures incorporate numerous member ends converging at multi-directional joint hubs. Furthermore, life-cycle, embodied energy, and embodied carbon assessments across civil engineering have shown that structural framing systems and secondary components can represent substantial portions of total cradle-to-gate emissions [14, 16, 17, 18], prompting structural optimization and sustainable design frameworks tailored to embodied energy and carbon mitigation [15, 19]. To the author’s knowledge, comparative studies evaluating structural bamboo space domes against equivalent steel configurations under normative, code-compliant sizing optimization are limited. Quantifying these trade-offs across material weight, embodied</w:t>
+        <w:t xml:space="preserve">In spatial bio-structural engineering, experimental and numerical investigations have demonstrated the feasibility of wide-span bamboo configurations. For example, Seixas et al. [44] analyzed self-supporting bamboo spatial structures with flexible joints through physical testing and numerical simulation, focusing on the mechanics of pantographic grids and joint compliance. Wu and Xiao [43] developed and experimentally tested a hybrid space truss combining glued laminated bamboo (glubam) members with steel chords and bolted spherical nodes, demonstrating the feasibility of substituting steel compression chords with bio-composites. In computational design, Frangedaki et al. [45] demonstrated sizing and shape optimization of tree-shaped bio-based structural systems using full-culm Guadua bamboo and earthen materials. However, existing comparative assessments predominantly focus on raw materials, individual structural members, hybrid prototypes, or whole-building envelopes. Rigorous structural sizing optimization of large-scale 3D raw bamboo space domes (</w:t>
+      </w:r>
+      <w:r>
+        <w:rPr>
+          <w:i/>
+          <w:iCs/>
+        </w:rPr>
+        <w:t xml:space="preserve">Guadua angustifolia</w:t>
+      </w:r>
+      <w:r>
+        <w:t xml:space="preserve">) using codified allowable stress design (ISO 22156 / NSR-10) directly benchmarked against code-optimized structural steel across multiple spans and topologies has, to the author’s knowledge, not been performed. Structure-level sizing is necessary: the structural mass, financial expenditure, and embodied carbon of any spatial framework depend directly on cross-sectional efficiency, member slenderness, and connection detailing, given that spatial lattice structures incorporate numerous member ends converging at multi-directional joint hubs. Furthermore, life-cycle, embodied energy, and embodied carbon assessments across civil engineering have shown that structural framing systems and secondary components can represent substantial portions of total cradle-to-gate emissions [14, 16, 17, 18], prompting structural optimization and sustainable design frameworks tailored to embodied energy and carbon mitigation [15, 19]. Quantifying these trade-offs across material weight, embodied</w:t>
       </w:r>
       <w:r>
         <w:t xml:space="preserve"> </w:t>
@@ -7494,6 +7530,54 @@
         </m:r>
       </m:oMath>
       <w:r>
+        <w:t xml:space="preserve">. No source gives the price of Guadua culms as a function of the diameter; the exponent</w:t>
+      </w:r>
+      <w:r>
+        <w:t xml:space="preserve"> </w:t>
+      </w:r>
+      <m:oMath>
+        <m:r>
+          <m:t>α</m:t>
+        </m:r>
+      </m:oMath>
+      <w:r>
+        <w:t xml:space="preserve"> </w:t>
+      </w:r>
+      <w:r>
+        <w:t xml:space="preserve">is an assumption of the study, and the results are reported for</w:t>
+      </w:r>
+      <w:r>
+        <w:t xml:space="preserve"> </w:t>
+      </w:r>
+      <m:oMath>
+        <m:r>
+          <m:t>α</m:t>
+        </m:r>
+        <m:r>
+          <m:rPr>
+            <m:sty m:val="p"/>
+          </m:rPr>
+          <m:t>=</m:t>
+        </m:r>
+        <m:r>
+          <m:t>1.5</m:t>
+        </m:r>
+      </m:oMath>
+      <w:r>
+        <w:t xml:space="preserve"> </w:t>
+      </w:r>
+      <w:r>
+        <w:t xml:space="preserve">to</w:t>
+      </w:r>
+      <w:r>
+        <w:t xml:space="preserve"> </w:t>
+      </w:r>
+      <m:oMath>
+        <m:r>
+          <m:t>3.0</m:t>
+        </m:r>
+      </m:oMath>
+      <w:r>
         <w:t xml:space="preserve">. Unit price inventories across four international economic regions are documented in Section 3.5.</w:t>
       </w:r>
     </w:p>
@@ -12752,13 +12836,240 @@
           <w:b/>
           <w:bCs/>
         </w:rPr>
+        <w:t xml:space="preserve">Methodological notes on LCI inventory assumptions.</w:t>
+      </w:r>
+      <w:r>
+        <w:t xml:space="preserve"> </w:t>
+      </w:r>
+      <w:r>
+        <w:t xml:space="preserve">Several inventory assumptions in Table 5 are highlighted for transparency: (i) The European structural steel plate EPD [39] (validity ended October 2023) represents an average across producing plants; to account for plant-level variations between electric arc and blast furnace routes, a broad sensitivity range of 0.5× to 2.0× (</w:t>
+      </w:r>
+      <m:oMath>
+        <m:r>
+          <m:t>E</m:t>
+        </m:r>
+        <m:sSub>
+          <m:e>
+            <m:r>
+              <m:t>C</m:t>
+            </m:r>
+          </m:e>
+          <m:sub>
+            <m:r>
+              <m:t>s</m:t>
+            </m:r>
+          </m:sub>
+        </m:sSub>
+        <m:r>
+          <m:rPr>
+            <m:sty m:val="p"/>
+          </m:rPr>
+          <m:t>=</m:t>
+        </m:r>
+        <m:r>
+          <m:t>0.565</m:t>
+        </m:r>
+      </m:oMath>
+      <w:r>
+        <w:t xml:space="preserve"> </w:t>
+      </w:r>
+      <w:r>
+        <w:t xml:space="preserve">to</w:t>
+      </w:r>
+      <w:r>
+        <w:t xml:space="preserve"> </w:t>
+      </w:r>
+      <m:oMath>
+        <m:r>
+          <m:t>2.26</m:t>
+        </m:r>
+        <m:sSub>
+          <m:e>
+            <m:r>
+              <m:rPr>
+                <m:nor/>
+              </m:rPr>
+              <m:t> kg CO</m:t>
+            </m:r>
+          </m:e>
+          <m:sub>
+            <m:r>
+              <m:t>2</m:t>
+            </m:r>
+          </m:sub>
+        </m:sSub>
+        <m:r>
+          <m:rPr>
+            <m:nor/>
+          </m:rPr>
+          <m:t>e/kg</m:t>
+        </m:r>
+      </m:oMath>
+      <w:r>
+        <w:t xml:space="preserve">) is evaluated in the parametric sweeps. (ii) The steel pipe factor [40] represents a single North American manufacturer (Welded Tube of Canada) as an indicative baseline for hollow structural sections. (iii) The road freight factor of</w:t>
+      </w:r>
+      <w:r>
+        <w:t xml:space="preserve"> </w:t>
+      </w:r>
+      <m:oMath>
+        <m:r>
+          <m:t>0.185</m:t>
+        </m:r>
+        <m:sSub>
+          <m:e>
+            <m:r>
+              <m:rPr>
+                <m:nor/>
+              </m:rPr>
+              <m:t> kg CO</m:t>
+            </m:r>
+          </m:e>
+          <m:sub>
+            <m:r>
+              <m:t>2</m:t>
+            </m:r>
+          </m:sub>
+        </m:sSub>
+        <m:r>
+          <m:rPr>
+            <m:nor/>
+          </m:rPr>
+          <m:t>e/(t</m:t>
+        </m:r>
+        <m:r>
+          <m:rPr>
+            <m:sty m:val="p"/>
+          </m:rPr>
+          <m:t>⋅</m:t>
+        </m:r>
+        <m:r>
+          <m:rPr>
+            <m:nor/>
+          </m:rPr>
+          <m:t>km)</m:t>
+        </m:r>
+      </m:oMath>
+      <w:r>
+        <w:t xml:space="preserve"> </w:t>
+      </w:r>
+      <w:r>
+        <w:t xml:space="preserve">is selected within the UK DEFRA [42] interval (</w:t>
+      </w:r>
+      <m:oMath>
+        <m:r>
+          <m:t>0.1782</m:t>
+        </m:r>
+      </m:oMath>
+      <w:r>
+        <w:t xml:space="preserve"> </w:t>
+      </w:r>
+      <w:r>
+        <w:t xml:space="preserve">to</w:t>
+      </w:r>
+      <w:r>
+        <w:t xml:space="preserve"> </w:t>
+      </w:r>
+      <m:oMath>
+        <m:r>
+          <m:t>0.2146</m:t>
+        </m:r>
+        <m:sSub>
+          <m:e>
+            <m:r>
+              <m:rPr>
+                <m:nor/>
+              </m:rPr>
+              <m:t> kg CO</m:t>
+            </m:r>
+          </m:e>
+          <m:sub>
+            <m:r>
+              <m:t>2</m:t>
+            </m:r>
+          </m:sub>
+        </m:sSub>
+        <m:r>
+          <m:rPr>
+            <m:nor/>
+          </m:rPr>
+          <m:t>e/(t</m:t>
+        </m:r>
+        <m:r>
+          <m:rPr>
+            <m:sty m:val="p"/>
+          </m:rPr>
+          <m:t>⋅</m:t>
+        </m:r>
+        <m:r>
+          <m:rPr>
+            <m:nor/>
+          </m:rPr>
+          <m:t>km)</m:t>
+        </m:r>
+      </m:oMath>
+      <w:r>
+        <w:t xml:space="preserve"> </w:t>
+      </w:r>
+      <w:r>
+        <w:t xml:space="preserve">for rigid goods vehicles). (iv) The upper-bound culm factor (</w:t>
+      </w:r>
+      <m:oMath>
+        <m:r>
+          <m:t>1.23</m:t>
+        </m:r>
+        <m:sSub>
+          <m:e>
+            <m:r>
+              <m:rPr>
+                <m:nor/>
+              </m:rPr>
+              <m:t> kg CO</m:t>
+            </m:r>
+          </m:e>
+          <m:sub>
+            <m:r>
+              <m:t>2</m:t>
+            </m:r>
+          </m:sub>
+        </m:sSub>
+        <m:r>
+          <m:rPr>
+            <m:nor/>
+          </m:rPr>
+          <m:t>e/kg</m:t>
+        </m:r>
+      </m:oMath>
+      <w:r>
+        <w:t xml:space="preserve">) is derived from the life-cycle inventory of industrial bamboo poles in [2], incorporating preservation, kiln drying, and transport. The sensitivity sweeps in Section 4.4 evaluate the influence of each assumption across these ranges.</w:t>
+      </w:r>
+    </w:p>
+    <w:p>
+      <w:pPr>
+        <w:pStyle w:val="BodyText"/>
+      </w:pPr>
+      <w:r>
+        <w:rPr>
+          <w:b/>
+          <w:bCs/>
+        </w:rPr>
         <w:t xml:space="preserve">International material cost scenarios.</w:t>
       </w:r>
       <w:r>
         <w:t xml:space="preserve"> </w:t>
       </w:r>
       <w:r>
-        <w:t xml:space="preserve">Direct material cost parameters are compiled across four developing and emerging market regions to capture geographic cost variations (Table 6). Indonesia serves as the baseline empirical reference market, where regional government schedules of rates (Jawa Tengah HSD 2024; exchange rate 15,855 IDR/USD) provide simultaneous local unit rates for bamboo culms, structural steel, and cementitious materials. For sensitivity analysis, illustrative cost models are developed for India (CPWD DSR 2023; 82.60 INR/USD), Türkiye (CSB 2026; 47.49 TRY/USD), and Colombia (commercial Guadua quotation 2026; exchange rate 4,053 COP/USD, where 38,500 COP per 6 m culm yields 1.583 USD/m). In these sensitivity scenarios, Indian and Turkish culm prices are scaled from the empirical Indonesian bamboo-to-steel price ratio, whereas Colombian steel and grout prices represent an emerging-market proxy (mean of Indonesian and Indian rates) combined with Colombian commercial Guadua pole quotes (Table 6).</w:t>
+        <w:t xml:space="preserve">Direct material cost parameters are compiled across four developing and emerging market regions to capture geographic cost variations (Table 6). Indonesia serves as the baseline empirical reference market, where regional government schedules of rates (Jawa Tengah HSD 2024, mean of the four regencies Cilacap, Banyumas, Purbalingga and Banjarnegara; exchange rate 15,855 IDR/USD) provide simultaneous local unit rates for bamboo culms, structural steel, and cementitious materials. For sensitivity analysis, illustrative cost models are developed for India (CPWD DSR 2023; 82.60 INR/USD), Türkiye (CSB 2026; 47.49 TRY/USD), and Colombia (price list for immunized Guadua of 27 June 2026, p. 4: 38,500 COP per 6 m unit; exchange rate 4,053 COP/USD, giving 1.583 USD/m; the list gives no diameter). The reference culm prices refer to poles of 60–80 mm diameter (Indonesia, with 70 mm taken as the reference) or to an unspecified diameter assumed as 120 mm (Colombia), and they are scaled to the diameters of the designs with the exponent</w:t>
+      </w:r>
+      <w:r>
+        <w:t xml:space="preserve"> </w:t>
+      </w:r>
+      <m:oMath>
+        <m:r>
+          <m:t>α</m:t>
+        </m:r>
+      </m:oMath>
+      <w:r>
+        <w:t xml:space="preserve">. In these sensitivity scenarios, Indian and Turkish culm prices are scaled from the empirical Indonesian bamboo-to-steel price ratio; the Turkish steel material price is the erected steel price of the schedule (106.70 TRY/kg) divided by the ratio of the Indian erected to material steel price (3.26), and the Turkish and Indian grout and culm prices follow from Indonesian ratios where the schedule has no item, whereas Colombian steel and grout prices represent an emerging-market proxy (mean of Indonesian and Indian rates) combined with Colombian commercial Guadua pole quotes (Table 6).</w:t>
       </w:r>
     </w:p>
     <w:tbl>
@@ -22042,7 +22353,7 @@
         <w:t xml:space="preserve"> </w:t>
       </w:r>
       <w:r>
-        <w:t xml:space="preserve">(Table 18). Only material unit prices are modelled, so the effect of labour, transport and erection costs on the large-span domes is not assessed; the results indicate that the grout volume governs the cost of the large-span domes.</w:t>
+        <w:t xml:space="preserve">(Table 18). Only material unit prices are modelled, so the effect of labour, transport and erection costs on the large-span domes is not assessed; the results indicate that the grout volume governs the cost of the large-span domes. Furthermore, regional price variations reflect processing differences: the commercial quotation from Colombia corresponds to chemically immunized (boron-treated and dried) Guadua culms, whereas the Indonesian baseline reflects unprocessed round culms. Although post-harvest chemical preservation increases initial culm acquisition costs, it is indispensable for structural durability, insect resistance, and fungal decay prevention in permanent load-bearing service.</w:t>
       </w:r>
     </w:p>
     <w:p>
@@ -22621,6 +22932,30 @@
       </w:r>
       <w:r>
         <w:t xml:space="preserve">. London.</w:t>
+      </w:r>
+    </w:p>
+    <w:p>
+      <w:pPr>
+        <w:pStyle w:val="BodyText"/>
+      </w:pPr>
+      <w:r>
+        <w:t xml:space="preserve">[43] Wu, Y., Xiao, Y., 2018. Steel and glubam hybrid space truss. Engineering Structures 171, 140–153. https://doi.org/10.1016/j.engstruct.2018.05.086</w:t>
+      </w:r>
+    </w:p>
+    <w:p>
+      <w:pPr>
+        <w:pStyle w:val="BodyText"/>
+      </w:pPr>
+      <w:r>
+        <w:t xml:space="preserve">[44] Seixas, M., Moreira, L.E., Stoffel, P., Bina, J., Ripper, J.L.M., Ferreira, J.L., Ghavami, K., 2021. Analysis of a self-supporting bamboo structure with flexible joints. International Journal of Space Structures 36 (2), 137–151. https://doi.org/10.1177/09560599211001660</w:t>
+      </w:r>
+    </w:p>
+    <w:p>
+      <w:pPr>
+        <w:pStyle w:val="BodyText"/>
+      </w:pPr>
+      <w:r>
+        <w:t xml:space="preserve">[45] Frangedaki, E., Sardone, L., Lagaros, N.D., 2021. Design optimization of tree-shaped structural systems and sustainable architecture using bamboo and earthen materials. Journal of Architectural Engineering 27 (4), 04021034. https://doi.org/10.1061/(ASCE)AE.1943-5568.0000492</w:t>
       </w:r>
     </w:p>
     <w:sectPr>

</xml_diff>

<commit_message>
Round 15: evidence for frequency-2 densification (354-member dome infeasible for bamboo), remove unsupported statements, add bamboo-steel comparison literature [46]-[48], Table 5 note, Wei/Zhang citations
Co-Authored-By: Claude Sonnet 5.5 <noreply@anthropic.com>
</commit_message>
<xml_diff>
--- a/05_Drafts/manuscript/MANUSCRIPT_FULL.docx
+++ b/05_Drafts/manuscript/MANUSCRIPT_FULL.docx
@@ -2,32 +2,6 @@
 <file path=word/document.xml><?xml version="1.0" encoding="utf-8"?>
 <w:document xmlns:w="http://schemas.openxmlformats.org/wordprocessingml/2006/main" xmlns:m="http://schemas.openxmlformats.org/officeDocument/2006/math" xmlns:r="http://schemas.openxmlformats.org/officeDocument/2006/relationships" xmlns:o="urn:schemas-microsoft-com:office:office" xmlns:v="urn:schemas-microsoft-com:vml" xmlns:w10="urn:schemas-microsoft-com:office:word" xmlns:a="http://schemas.openxmlformats.org/drawingml/2006/main" xmlns:pic="http://schemas.openxmlformats.org/drawingml/2006/picture" xmlns:wp="http://schemas.openxmlformats.org/drawingml/2006/wordprocessingDrawing">
   <w:body>
-    <w:sdt>
-      <w:sdtPr>
-        <w:docPartObj>
-          <w:docPartGallery w:val="Table of Contents"/>
-          <w:docPartUnique/>
-        </w:docPartObj>
-      </w:sdtPr>
-      <w:sdtContent>
-        <w:p>
-          <w:pPr>
-            <w:pStyle w:val="TOCHeading"/>
-          </w:pPr>
-          <w:r>
-            <w:t xml:space="preserve">Table of Contents</w:t>
-          </w:r>
-        </w:p>
-        <w:p>
-          <w:r>
-            <w:fldChar w:fldCharType="begin" w:dirty="true"/>
-            <w:instrText xml:space="preserve">TOC \o "1-3" \h \z \u</w:instrText>
-            <w:fldChar w:fldCharType="separate"/>
-            <w:fldChar w:fldCharType="end"/>
-          </w:r>
-        </w:p>
-      </w:sdtContent>
-    </w:sdt>
     <w:p>
       <w:pPr>
         <w:pStyle w:val="Heading1"/>
@@ -200,17 +174,7 @@
         <w:pStyle w:val="BodyText"/>
       </w:pPr>
       <w:r>
-        <w:t xml:space="preserve">In spatial bio-structural engineering, experimental and numerical investigations have demonstrated the feasibility of wide-span bamboo configurations. For example, Seixas et al. [44] analyzed self-supporting bamboo spatial structures with flexible joints through physical testing and numerical simulation, focusing on the mechanics of pantographic grids and joint compliance. Wu and Xiao [43] developed and experimentally tested a hybrid space truss combining glued laminated bamboo (glubam) members with steel chords and bolted spherical nodes, demonstrating the feasibility of substituting steel compression chords with bio-composites. In computational design, Frangedaki et al. [45] demonstrated sizing and shape optimization of tree-shaped bio-based structural systems using full-culm Guadua bamboo and earthen materials. However, existing comparative assessments predominantly focus on raw materials, individual structural members, hybrid prototypes, or whole-building envelopes. Rigorous structural sizing optimization of large-scale 3D raw bamboo space domes (</w:t>
-      </w:r>
-      <w:r>
-        <w:rPr>
-          <w:i/>
-          <w:iCs/>
-        </w:rPr>
-        <w:t xml:space="preserve">Guadua angustifolia</w:t>
-      </w:r>
-      <w:r>
-        <w:t xml:space="preserve">) using codified allowable stress design (ISO 22156 / NSR-10) directly benchmarked against code-optimized structural steel across multiple spans and topologies has, to the author’s knowledge, not been performed. Structure-level sizing is necessary: the structural mass, financial expenditure, and embodied carbon of any spatial framework depend directly on cross-sectional efficiency, member slenderness, and connection detailing, given that spatial lattice structures incorporate numerous member ends converging at multi-directional joint hubs. Furthermore, life-cycle, embodied energy, and embodied carbon assessments across civil engineering have shown that structural framing systems and secondary components can represent substantial portions of total cradle-to-gate emissions [14, 16, 17, 18], prompting structural optimization and sustainable design frameworks tailored to embodied energy and carbon mitigation [15, 19]. Quantifying these trade-offs across material weight, embodied</w:t>
+        <w:t xml:space="preserve">In spatial bio-structural engineering, experimental and numerical studies have shown that bamboo space structures are feasible. Wu and Xiao [43] tested a full-scale space truss with glubam web and upper chord members and steel pipe lower chords joined by bolted steel clamping plates, and built a prototype canopy. Seixas et al. [44] studied self-supporting modules of bamboo round poles with flexible joints in a 1:3 scale prototype and a full-scale structure. Frangedaki et al. [45] optimized tree-shaped structural systems of Guadua with a parametric design optimization approach. Bamboo has also been compared with steel or concrete in life cycle carbon and cost. Zhang et al. [46] compared a steel-glubam hybrid truss with an imaginary steel truss of the same overall dimensions, Zhang et al. [47] compared a steel-bamboo composite frame of a rural house with a reinforced concrete frame (17.6% lower life cycle emissions), and Wei et al. [48] optimized bamboo-steel hybrid scaffolding for life cycle carbon and cost with NSGA-II (up to 99.6% lower carbon than steel scaffolding at a 4.7% higher cost). These studies address prototypes, joint behavior, geometry, and engineered or hybrid bamboo systems and temporary structures. None of them sizes a raw-culm bamboo space dome and a steel dome of the same geometry, each to its own optimum under code constraints, or compares weight, embodied carbon and cost with the connection steel and grout included. To the author’s knowledge, such a comparison has not been published. Structure-level sizing is necessary: the structural mass, financial expenditure, and embodied carbon of any spatial framework depend directly on cross-sectional efficiency, member slenderness, and connection detailing, given that spatial lattice structures incorporate numerous member ends converging at multi-directional joint hubs. Furthermore, life-cycle, embodied energy, and embodied carbon assessments across civil engineering have shown that structural framing systems and secondary components can represent substantial portions of total cradle-to-gate emissions [14, 16, 17, 18], prompting structural optimization and sustainable design frameworks tailored to embodied energy and carbon mitigation [15, 19]. Quantifying these trade-offs across material weight, embodied</w:t>
       </w:r>
       <w:r>
         <w:t xml:space="preserve"> </w:t>
@@ -8298,7 +8262,7 @@
         <w:t xml:space="preserve"> </w:t>
       </w:r>
       <w:r>
-        <w:t xml:space="preserve">Derived from the well-established 40 m, 354-member benchmark space dome extensively investigated in steel optimization literature [20, 30, 31]. In the original 354-member geometry, member lengths reach up to 5.97 m, which exceeds practical unbraced buckling limits for naturally grown structural bamboo culms. To make the topology viable for natural bio-materials without violating transportable culm lengths, a frequency-2 topological densification was executed, generating 505 nodes, 1464 members, and 43 design groups with member lengths strictly constrained between 0.76 m and 3.08 m. The 48 foundation support nodes are pinned.</w:t>
+        <w:t xml:space="preserve">Derived from the well-established 40 m, 354-member benchmark space dome extensively investigated in steel optimization literature [20, 30, 31]. The original 354-member geometry has member lengths of 2.94 m to 5.97 m. With the constraints of this study no feasible bamboo design was found for it: with the largest catalogue section in all groups the sum of the normalized constraint violations is P = 9.12, the largest member force of 75.5 kN exceeds the joint capacity of 49.3 kN in 66 members, and three ABC runs from different seeds ended at P = 9.32. A frequency-2 topological densification was therefore applied, generating 505 nodes, 1464 members, and 43 design groups with member lengths strictly constrained between 0.76 m and 3.08 m. The 48 foundation support nodes are pinned.</w:t>
       </w:r>
       <w:r>
         <w:t xml:space="preserve"> </w:t>
@@ -12824,7 +12788,7 @@
         <w:t xml:space="preserve"> </w:t>
       </w:r>
       <w:r>
-        <w:t xml:space="preserve">Cradle-to-gate embodied carbon emission factors. The steel and grout factors are the values declared in environmental product declarations (EPD) [39–41]. The freight factor of 0.185 kg CO₂e/(t·km) is a value of the author close to the values of 0.1782 (average load) and 0.2146 kg CO₂e/(t·km) (50% load) given for rigid goods vehicles in the UK DESNZ/DEFRA 2023 conversion factors [42] (100% load: 0.1251); the factor 3.8 corrects for the low bulk density of culms (100 kg/m³) relative to the load capacity of the lorry in the inventory [2].</w:t>
+        <w:t xml:space="preserve">Cradle-to-gate embodied carbon emission factors. The steel and grout factors are the values declared in environmental product declarations (EPD) [39–41]. The freight factor of 0.185 kg CO₂e/(t·km) is a value of the author close to the values of 0.1782 (average load) and 0.2146 kg CO₂e/(t·km) (50% load) given for rigid goods vehicles in the UK DESNZ/DEFRA 2023 conversion factors [42] (100% load: 0.1251); the factor 3.8 corrects for the low bulk density of culms (100 kg/m³) relative to the load capacity of the lorry in the inventory [2]. The connection steel factor is the average of the plants of one EPD [39] that expired on 24.10.2023, and the pipe factor is the value of one producer [40]; the plants of [39] range from 0.5 to 2 times its average. The culm factor adds the cultivation, harvesting and plantation-to-factory transport of a laminated bamboo board (0.0156 + 0.0168 kg CO₂e/kg [38]) to the delivery to the site (0.185 × 0.3 × 3.8 = 0.211). The highest culm value tested, 1.23 kg CO₂e/kg, is derived from Table 8 of [2] for bamboo poles including drying, treatment and transport and is not a physical bound.</w:t>
       </w:r>
     </w:p>
     <w:p>
@@ -22353,7 +22317,7 @@
         <w:t xml:space="preserve"> </w:t>
       </w:r>
       <w:r>
-        <w:t xml:space="preserve">(Table 18). Only material unit prices are modelled, so the effect of labour, transport and erection costs on the large-span domes is not assessed; the results indicate that the grout volume governs the cost of the large-span domes. Furthermore, regional price variations reflect processing differences: the commercial quotation from Colombia corresponds to chemically immunized (boron-treated and dried) Guadua culms, whereas the Indonesian baseline reflects unprocessed round culms. Although post-harvest chemical preservation increases initial culm acquisition costs, it is indispensable for structural durability, insect resistance, and fungal decay prevention in permanent load-bearing service.</w:t>
+        <w:t xml:space="preserve">(Table 18). Only material unit prices are modelled, so the effect of labour, transport and erection costs on the large-span domes is not assessed; the results indicate that the grout volume governs the cost of the large-span domes. The Colombian price refers to Guadua culms immunized by immersion, and the schedule of the Indonesian baseline does not state the processing of the bamboo it prices, so the two culm prices may not describe the same product. Although post-harvest chemical preservation increases initial culm acquisition costs, it is indispensable for structural durability, insect resistance, and fungal decay prevention in permanent load-bearing service.</w:t>
       </w:r>
     </w:p>
     <w:p>
@@ -22956,6 +22920,30 @@
       </w:pPr>
       <w:r>
         <w:t xml:space="preserve">[45] Frangedaki, E., Sardone, L., Lagaros, N.D., 2021. Design optimization of tree-shaped structural systems and sustainable architecture using bamboo and earthen materials. Journal of Architectural Engineering 27 (4), 04021034. https://doi.org/10.1061/(ASCE)AE.1943-5568.0000492</w:t>
+      </w:r>
+    </w:p>
+    <w:p>
+      <w:pPr>
+        <w:pStyle w:val="BodyText"/>
+      </w:pPr>
+      <w:r>
+        <w:t xml:space="preserve">[46] Zhang, J., Xu, J., Wu, Y., Xie, T., Bo, L., Li, Z., 2023. Life cycle assessment of steel-glued laminated bamboo (GluBam) hybrid truss in China. Energy and Buildings 294, 113218. https://doi.org/10.1016/j.enbuild.2023.113218</w:t>
+      </w:r>
+    </w:p>
+    <w:p>
+      <w:pPr>
+        <w:pStyle w:val="BodyText"/>
+      </w:pPr>
+      <w:r>
+        <w:t xml:space="preserve">[47] Zhang, X., Xu, J., Zhang, X., Li, Y., 2021. Life cycle carbon emission reduction potential of a new steel-bamboo composite frame structure for residential houses. Journal of Building Engineering 39, 102295. https://doi.org/10.1016/j.jobe.2021.102295</w:t>
+      </w:r>
+    </w:p>
+    <w:p>
+      <w:pPr>
+        <w:pStyle w:val="BodyText"/>
+      </w:pPr>
+      <w:r>
+        <w:t xml:space="preserve">[48] Wei, X., Xue, F., Wang, J., Liang, D., 2026. Bi-objective optimization of low-carbon, low-cost scaffolding design using bamboo and steel with a study in China. Resources, Conservation &amp; Recycling Advances 30, 200334. https://doi.org/10.1016/j.rcradv.2026.200334</w:t>
       </w:r>
     </w:p>
     <w:sectPr>

</xml_diff>